<commit_message>
Make TAP main tree canonical for v4
</commit_message>
<xml_diff>
--- a/papers/TAP_paper/v4_to_coauthors/emmeric/nota_aan_emmeric_TAP_v3_feedback.docx
+++ b/papers/TAP_paper/v4_to_coauthors/emmeric/nota_aan_emmeric_TAP_v3_feedback.docx
@@ -748,6 +748,18 @@
                 <w:rStyle w:val="VerbatimChar"/>
               </w:rPr>
               <w:t xml:space="preserve">accepted for publication, 2026</w:t>
+            </w:r>
+            <w:r>
+              <w:t xml:space="preserve">, met DOI</w:t>
+            </w:r>
+            <w:r>
+              <w:t xml:space="preserve"> </w:t>
+            </w:r>
+            <w:r>
+              <w:rPr>
+                <w:rStyle w:val="VerbatimChar"/>
+              </w:rPr>
+              <w:t xml:space="preserve">10.1088/1361-6560/ae97ac</w:t>
             </w:r>
             <w:r>
               <w:t xml:space="preserve">.</w:t>

</xml_diff>

<commit_message>
Make TAP main tree canonical for v4 (#933)
## Summary

- move the approved v4 manuscript edits into the canonical PaperMaker
tree
- add the PMB DOI and refresh the v4 manuscript, Word note, and
latexdiff
- replace the v3 patch script with a main-based v4 exporter

## Verification

- PaperMaker round-trip matches `paper.tex`
- v4 exporter reproduces the canonical manuscript and unchanged SI
byte-for-byte
- manuscript and latexdiff compile to 14-page PDFs
- Ruff and applicable pre-commit hooks pass
- DOCX archive and DOI content checks pass
</commit_message>
<xml_diff>
--- a/papers/TAP_paper/v4_to_coauthors/emmeric/nota_aan_emmeric_TAP_v3_feedback.docx
+++ b/papers/TAP_paper/v4_to_coauthors/emmeric/nota_aan_emmeric_TAP_v3_feedback.docx
@@ -748,6 +748,18 @@
                 <w:rStyle w:val="VerbatimChar"/>
               </w:rPr>
               <w:t xml:space="preserve">accepted for publication, 2026</w:t>
+            </w:r>
+            <w:r>
+              <w:t xml:space="preserve">, met DOI</w:t>
+            </w:r>
+            <w:r>
+              <w:t xml:space="preserve"> </w:t>
+            </w:r>
+            <w:r>
+              <w:rPr>
+                <w:rStyle w:val="VerbatimChar"/>
+              </w:rPr>
+              <w:t xml:space="preserve">10.1088/1361-6560/ae97ac</w:t>
             </w:r>
             <w:r>
               <w:t xml:space="preserve">.</w:t>

</xml_diff>